<commit_message>
tech basic, non tech, paper reading palm plan created
</commit_message>
<xml_diff>
--- a/AI_Business_Impact.docx
+++ b/AI_Business_Impact.docx
@@ -2,6 +2,11 @@
 <file path=word/document.xml><?xml version="1.0" encoding="utf-8"?>
 <w:document xmlns:wpc="http://schemas.microsoft.com/office/word/2010/wordprocessingCanvas" xmlns:cx="http://schemas.microsoft.com/office/drawing/2014/chartex" xmlns:cx1="http://schemas.microsoft.com/office/drawing/2015/9/8/chartex" xmlns:cx2="http://schemas.microsoft.com/office/drawing/2015/10/21/chartex" xmlns:cx3="http://schemas.microsoft.com/office/drawing/2016/5/9/chartex" xmlns:cx4="http://schemas.microsoft.com/office/drawing/2016/5/10/chartex" xmlns:cx5="http://schemas.microsoft.com/office/drawing/2016/5/11/chartex" xmlns:cx6="http://schemas.microsoft.com/office/drawing/2016/5/12/chartex" xmlns:cx7="http://schemas.microsoft.com/office/drawing/2016/5/13/chartex" xmlns:cx8="http://schemas.microsoft.com/office/drawing/2016/5/14/chartex" xmlns:mc="http://schemas.openxmlformats.org/markup-compatibility/2006" xmlns:aink="http://schemas.microsoft.com/office/drawing/2016/ink" xmlns:am3d="http://schemas.microsoft.com/office/drawing/2017/model3d" xmlns:o="urn:schemas-microsoft-com:office:office" xmlns:oel="http://schemas.microsoft.com/office/2019/extlst" xmlns:r="http://schemas.openxmlformats.org/officeDocument/2006/relationships" xmlns:m="http://schemas.openxmlformats.org/officeDocument/2006/math" xmlns:v="urn:schemas-microsoft-com:vml" xmlns:wp14="http://schemas.microsoft.com/office/word/2010/wordprocessingDrawing" xmlns:wp="http://schemas.openxmlformats.org/drawingml/2006/wordprocessingDrawing" xmlns:w10="urn:schemas-microsoft-com:office:word" xmlns:w="http://schemas.openxmlformats.org/wordprocessingml/2006/main" xmlns:w14="http://schemas.microsoft.com/office/word/2010/wordml" xmlns:w15="http://schemas.microsoft.com/office/word/2012/wordml" xmlns:w16cex="http://schemas.microsoft.com/office/word/2018/wordml/cex" xmlns:w16cid="http://schemas.microsoft.com/office/word/2016/wordml/cid" xmlns:w16="http://schemas.microsoft.com/office/word/2018/wordml" xmlns:w16du="http://schemas.microsoft.com/office/word/2023/wordml/word16du" xmlns:w16sdtdh="http://schemas.microsoft.com/office/word/2020/wordml/sdtdatahash" xmlns:w16sdtfl="http://schemas.microsoft.com/office/word/2024/wordml/sdtformatlock" xmlns:w16se="http://schemas.microsoft.com/office/word/2015/wordml/symex" xmlns:wpg="http://schemas.microsoft.com/office/word/2010/wordprocessingGroup" xmlns:wpi="http://schemas.microsoft.com/office/word/2010/wordprocessingInk" xmlns:wne="http://schemas.microsoft.com/office/word/2006/wordml" xmlns:wps="http://schemas.microsoft.com/office/word/2010/wordprocessingShape" mc:Ignorable="w14 w15 w16se w16cid w16 w16cex w16sdtdh w16sdtfl w16du wp14">
   <w:body>
+    <w:p>
+      <w:pPr>
+        <w:pStyle w:val="Heading1"/>
+      </w:pPr>
+    </w:p>
     <w:p>
       <w:pPr>
         <w:pStyle w:val="Heading1"/>
@@ -119,6 +124,7 @@
     </w:p>
     <w:p>
       <w:r>
+        <w:lastRenderedPageBreak/>
         <w:t>•  AI in Resource Allocation: AI analyzes workloads and assigns tasks based on efficiency.</w:t>
       </w:r>
     </w:p>
@@ -132,7 +138,6 @@
         <w:pStyle w:val="Heading2"/>
       </w:pPr>
       <w:r>
-        <w:lastRenderedPageBreak/>
         <w:t>AI for Product Managers: The Power of AI-Driven Analytics</w:t>
       </w:r>
     </w:p>
@@ -9954,7 +9959,7 @@
       </w:tcPr>
     </w:tblStylePr>
   </w:style>
-  <w:style w:type="table" w:styleId="ColorfulShading">
+  <w:style w:type="table" w:styleId="ColourfulShading">
     <w:name w:val="Colorful Shading"/>
     <w:basedOn w:val="TableNormal"/>
     <w:uiPriority w:val="71"/>
@@ -10069,7 +10074,7 @@
       </w:rPr>
     </w:tblStylePr>
   </w:style>
-  <w:style w:type="table" w:styleId="ColorfulShading-Accent1">
+  <w:style w:type="table" w:styleId="ColourfulShadingAccent1">
     <w:name w:val="Colorful Shading Accent 1"/>
     <w:basedOn w:val="TableNormal"/>
     <w:uiPriority w:val="71"/>
@@ -10184,7 +10189,7 @@
       </w:rPr>
     </w:tblStylePr>
   </w:style>
-  <w:style w:type="table" w:styleId="ColorfulShading-Accent2">
+  <w:style w:type="table" w:styleId="ColourfulShadingAccent2">
     <w:name w:val="Colorful Shading Accent 2"/>
     <w:basedOn w:val="TableNormal"/>
     <w:uiPriority w:val="71"/>
@@ -10299,7 +10304,7 @@
       </w:rPr>
     </w:tblStylePr>
   </w:style>
-  <w:style w:type="table" w:styleId="ColorfulShading-Accent3">
+  <w:style w:type="table" w:styleId="ColourfulShadingAccent3">
     <w:name w:val="Colorful Shading Accent 3"/>
     <w:basedOn w:val="TableNormal"/>
     <w:uiPriority w:val="71"/>
@@ -10404,7 +10409,7 @@
       </w:tcPr>
     </w:tblStylePr>
   </w:style>
-  <w:style w:type="table" w:styleId="ColorfulShading-Accent4">
+  <w:style w:type="table" w:styleId="ColourfulShadingAccent4">
     <w:name w:val="Colorful Shading Accent 4"/>
     <w:basedOn w:val="TableNormal"/>
     <w:uiPriority w:val="71"/>
@@ -10519,7 +10524,7 @@
       </w:rPr>
     </w:tblStylePr>
   </w:style>
-  <w:style w:type="table" w:styleId="ColorfulShading-Accent5">
+  <w:style w:type="table" w:styleId="ColourfulShadingAccent5">
     <w:name w:val="Colorful Shading Accent 5"/>
     <w:basedOn w:val="TableNormal"/>
     <w:uiPriority w:val="71"/>
@@ -10634,7 +10639,7 @@
       </w:rPr>
     </w:tblStylePr>
   </w:style>
-  <w:style w:type="table" w:styleId="ColorfulShading-Accent6">
+  <w:style w:type="table" w:styleId="ColourfulShadingAccent6">
     <w:name w:val="Colorful Shading Accent 6"/>
     <w:basedOn w:val="TableNormal"/>
     <w:uiPriority w:val="71"/>
@@ -10749,7 +10754,7 @@
       </w:rPr>
     </w:tblStylePr>
   </w:style>
-  <w:style w:type="table" w:styleId="ColorfulList">
+  <w:style w:type="table" w:styleId="ColourfulList">
     <w:name w:val="Colorful List"/>
     <w:basedOn w:val="TableNormal"/>
     <w:uiPriority w:val="72"/>
@@ -10828,7 +10833,7 @@
       </w:tcPr>
     </w:tblStylePr>
   </w:style>
-  <w:style w:type="table" w:styleId="ColorfulList-Accent1">
+  <w:style w:type="table" w:styleId="ColourfulListAccent1">
     <w:name w:val="Colorful List Accent 1"/>
     <w:basedOn w:val="TableNormal"/>
     <w:uiPriority w:val="72"/>
@@ -10907,7 +10912,7 @@
       </w:tcPr>
     </w:tblStylePr>
   </w:style>
-  <w:style w:type="table" w:styleId="ColorfulList-Accent2">
+  <w:style w:type="table" w:styleId="ColourfulListAccent2">
     <w:name w:val="Colorful List Accent 2"/>
     <w:basedOn w:val="TableNormal"/>
     <w:uiPriority w:val="72"/>
@@ -10986,7 +10991,7 @@
       </w:tcPr>
     </w:tblStylePr>
   </w:style>
-  <w:style w:type="table" w:styleId="ColorfulList-Accent3">
+  <w:style w:type="table" w:styleId="ColourfulListAccent3">
     <w:name w:val="Colorful List Accent 3"/>
     <w:basedOn w:val="TableNormal"/>
     <w:uiPriority w:val="72"/>
@@ -11065,7 +11070,7 @@
       </w:tcPr>
     </w:tblStylePr>
   </w:style>
-  <w:style w:type="table" w:styleId="ColorfulList-Accent4">
+  <w:style w:type="table" w:styleId="ColourfulListAccent4">
     <w:name w:val="Colorful List Accent 4"/>
     <w:basedOn w:val="TableNormal"/>
     <w:uiPriority w:val="72"/>
@@ -11144,7 +11149,7 @@
       </w:tcPr>
     </w:tblStylePr>
   </w:style>
-  <w:style w:type="table" w:styleId="ColorfulList-Accent5">
+  <w:style w:type="table" w:styleId="ColourfulListAccent5">
     <w:name w:val="Colorful List Accent 5"/>
     <w:basedOn w:val="TableNormal"/>
     <w:uiPriority w:val="72"/>
@@ -11223,7 +11228,7 @@
       </w:tcPr>
     </w:tblStylePr>
   </w:style>
-  <w:style w:type="table" w:styleId="ColorfulList-Accent6">
+  <w:style w:type="table" w:styleId="ColourfulListAccent6">
     <w:name w:val="Colorful List Accent 6"/>
     <w:basedOn w:val="TableNormal"/>
     <w:uiPriority w:val="72"/>
@@ -11302,7 +11307,7 @@
       </w:tcPr>
     </w:tblStylePr>
   </w:style>
-  <w:style w:type="table" w:styleId="ColorfulGrid">
+  <w:style w:type="table" w:styleId="ColourfulGrid">
     <w:name w:val="Colorful Grid"/>
     <w:basedOn w:val="TableNormal"/>
     <w:uiPriority w:val="73"/>
@@ -11375,7 +11380,7 @@
       </w:tcPr>
     </w:tblStylePr>
   </w:style>
-  <w:style w:type="table" w:styleId="ColorfulGrid-Accent1">
+  <w:style w:type="table" w:styleId="ColourfulGridAccent1">
     <w:name w:val="Colorful Grid Accent 1"/>
     <w:basedOn w:val="TableNormal"/>
     <w:uiPriority w:val="73"/>
@@ -11448,7 +11453,7 @@
       </w:tcPr>
     </w:tblStylePr>
   </w:style>
-  <w:style w:type="table" w:styleId="ColorfulGrid-Accent2">
+  <w:style w:type="table" w:styleId="ColourfulGridAccent2">
     <w:name w:val="Colorful Grid Accent 2"/>
     <w:basedOn w:val="TableNormal"/>
     <w:uiPriority w:val="73"/>
@@ -11521,7 +11526,7 @@
       </w:tcPr>
     </w:tblStylePr>
   </w:style>
-  <w:style w:type="table" w:styleId="ColorfulGrid-Accent3">
+  <w:style w:type="table" w:styleId="ColourfulGridAccent3">
     <w:name w:val="Colorful Grid Accent 3"/>
     <w:basedOn w:val="TableNormal"/>
     <w:uiPriority w:val="73"/>
@@ -11594,7 +11599,7 @@
       </w:tcPr>
     </w:tblStylePr>
   </w:style>
-  <w:style w:type="table" w:styleId="ColorfulGrid-Accent4">
+  <w:style w:type="table" w:styleId="ColourfulGridAccent4">
     <w:name w:val="Colorful Grid Accent 4"/>
     <w:basedOn w:val="TableNormal"/>
     <w:uiPriority w:val="73"/>
@@ -11667,7 +11672,7 @@
       </w:tcPr>
     </w:tblStylePr>
   </w:style>
-  <w:style w:type="table" w:styleId="ColorfulGrid-Accent5">
+  <w:style w:type="table" w:styleId="ColourfulGridAccent5">
     <w:name w:val="Colorful Grid Accent 5"/>
     <w:basedOn w:val="TableNormal"/>
     <w:uiPriority w:val="73"/>
@@ -11740,7 +11745,7 @@
       </w:tcPr>
     </w:tblStylePr>
   </w:style>
-  <w:style w:type="table" w:styleId="ColorfulGrid-Accent6">
+  <w:style w:type="table" w:styleId="ColourfulGridAccent6">
     <w:name w:val="Colorful Grid Accent 6"/>
     <w:basedOn w:val="TableNormal"/>
     <w:uiPriority w:val="73"/>

</xml_diff>